<commit_message>
feat: implement role-based isolation for teachers and master aggregator view for Kepsek
</commit_message>
<xml_diff>
--- a/Pass supa.docx
+++ b/Pass supa.docx
@@ -4,7 +4,23 @@
   <w:body>
     <w:p>
       <w:r>
-        <w:t xml:space="preserve">Vercel : </w:t>
+        <w:t>ALIHSAN</w:t>
+      </w:r>
+    </w:p>
+    <w:p/>
+    <w:p>
+      <w:proofErr w:type="spellStart"/>
+      <w:proofErr w:type="gramStart"/>
+      <w:r>
+        <w:t>Vercel</w:t>
+      </w:r>
+      <w:proofErr w:type="spellEnd"/>
+      <w:r>
+        <w:t xml:space="preserve"> :</w:t>
+      </w:r>
+      <w:proofErr w:type="gramEnd"/>
+      <w:r>
+        <w:t xml:space="preserve"> </w:t>
       </w:r>
       <w:r>
         <w:t>https://sdit-al-ihsan-command-center.vercel.app/executive</w:t>
@@ -297,8 +313,45 @@
                 <w:szCs w:val="24"/>
                 <w:lang w:eastAsia="en-ID"/>
               </w:rPr>
-              <w:t>Nama Lengkap / Identitas</w:t>
-            </w:r>
+              <w:t xml:space="preserve">Nama </w:t>
+            </w:r>
+            <w:proofErr w:type="spellStart"/>
+            <w:r>
+              <w:rPr>
+                <w:rFonts w:ascii="Times New Roman" w:eastAsia="Times New Roman" w:hAnsi="Times New Roman" w:cs="Times New Roman"/>
+                <w:b/>
+                <w:bCs/>
+                <w:sz w:val="24"/>
+                <w:szCs w:val="24"/>
+                <w:lang w:eastAsia="en-ID"/>
+              </w:rPr>
+              <w:t>Lengkap</w:t>
+            </w:r>
+            <w:proofErr w:type="spellEnd"/>
+            <w:r>
+              <w:rPr>
+                <w:rFonts w:ascii="Times New Roman" w:eastAsia="Times New Roman" w:hAnsi="Times New Roman" w:cs="Times New Roman"/>
+                <w:b/>
+                <w:bCs/>
+                <w:sz w:val="24"/>
+                <w:szCs w:val="24"/>
+                <w:lang w:eastAsia="en-ID"/>
+              </w:rPr>
+              <w:t xml:space="preserve"> / </w:t>
+            </w:r>
+            <w:proofErr w:type="spellStart"/>
+            <w:r>
+              <w:rPr>
+                <w:rFonts w:ascii="Times New Roman" w:eastAsia="Times New Roman" w:hAnsi="Times New Roman" w:cs="Times New Roman"/>
+                <w:b/>
+                <w:bCs/>
+                <w:sz w:val="24"/>
+                <w:szCs w:val="24"/>
+                <w:lang w:eastAsia="en-ID"/>
+              </w:rPr>
+              <w:t>Identitas</w:t>
+            </w:r>
+            <w:proofErr w:type="spellEnd"/>
           </w:p>
         </w:tc>
         <w:tc>
@@ -329,16 +382,29 @@
                 <w:lang w:eastAsia="en-ID"/>
               </w:rPr>
             </w:pPr>
-            <w:r>
-              <w:rPr>
-                <w:rFonts w:ascii="Times New Roman" w:eastAsia="Times New Roman" w:hAnsi="Times New Roman" w:cs="Times New Roman"/>
-                <w:b/>
-                <w:bCs/>
-                <w:sz w:val="24"/>
-                <w:szCs w:val="24"/>
-                <w:lang w:eastAsia="en-ID"/>
-              </w:rPr>
-              <w:t>Akses Utama</w:t>
+            <w:proofErr w:type="spellStart"/>
+            <w:r>
+              <w:rPr>
+                <w:rFonts w:ascii="Times New Roman" w:eastAsia="Times New Roman" w:hAnsi="Times New Roman" w:cs="Times New Roman"/>
+                <w:b/>
+                <w:bCs/>
+                <w:sz w:val="24"/>
+                <w:szCs w:val="24"/>
+                <w:lang w:eastAsia="en-ID"/>
+              </w:rPr>
+              <w:t>Akses</w:t>
+            </w:r>
+            <w:proofErr w:type="spellEnd"/>
+            <w:r>
+              <w:rPr>
+                <w:rFonts w:ascii="Times New Roman" w:eastAsia="Times New Roman" w:hAnsi="Times New Roman" w:cs="Times New Roman"/>
+                <w:b/>
+                <w:bCs/>
+                <w:sz w:val="24"/>
+                <w:szCs w:val="24"/>
+                <w:lang w:eastAsia="en-ID"/>
+              </w:rPr>
+              <w:t xml:space="preserve"> Utama</w:t>
             </w:r>
           </w:p>
         </w:tc>
@@ -375,17 +441,43 @@
                 <w:lang w:eastAsia="en-ID"/>
               </w:rPr>
             </w:pPr>
-            <w:r>
-              <w:rPr>
-                <w:rFonts w:ascii="Times New Roman" w:eastAsia="Times New Roman" w:hAnsi="Times New Roman" w:cs="Times New Roman"/>
-                <w:b/>
-                <w:bCs/>
-                <w:sz w:val="24"/>
-                <w:szCs w:val="24"/>
-                <w:lang w:eastAsia="en-ID"/>
-              </w:rPr>
-              <w:t>Kepala Sekolah</w:t>
-            </w:r>
+            <w:proofErr w:type="spellStart"/>
+            <w:r>
+              <w:rPr>
+                <w:rFonts w:ascii="Times New Roman" w:eastAsia="Times New Roman" w:hAnsi="Times New Roman" w:cs="Times New Roman"/>
+                <w:b/>
+                <w:bCs/>
+                <w:sz w:val="24"/>
+                <w:szCs w:val="24"/>
+                <w:lang w:eastAsia="en-ID"/>
+              </w:rPr>
+              <w:t>Kepala</w:t>
+            </w:r>
+            <w:proofErr w:type="spellEnd"/>
+            <w:r>
+              <w:rPr>
+                <w:rFonts w:ascii="Times New Roman" w:eastAsia="Times New Roman" w:hAnsi="Times New Roman" w:cs="Times New Roman"/>
+                <w:b/>
+                <w:bCs/>
+                <w:sz w:val="24"/>
+                <w:szCs w:val="24"/>
+                <w:lang w:eastAsia="en-ID"/>
+              </w:rPr>
+              <w:t xml:space="preserve"> </w:t>
+            </w:r>
+            <w:proofErr w:type="spellStart"/>
+            <w:r>
+              <w:rPr>
+                <w:rFonts w:ascii="Times New Roman" w:eastAsia="Times New Roman" w:hAnsi="Times New Roman" w:cs="Times New Roman"/>
+                <w:b/>
+                <w:bCs/>
+                <w:sz w:val="24"/>
+                <w:szCs w:val="24"/>
+                <w:lang w:eastAsia="en-ID"/>
+              </w:rPr>
+              <w:t>Sekolah</w:t>
+            </w:r>
+            <w:proofErr w:type="spellEnd"/>
           </w:p>
         </w:tc>
         <w:tc>
@@ -505,6 +597,7 @@
               </w:rPr>
               <w:t xml:space="preserve">H. Ahmad Dahlan, </w:t>
             </w:r>
+            <w:proofErr w:type="spellStart"/>
             <w:proofErr w:type="gramStart"/>
             <w:r>
               <w:rPr>
@@ -517,6 +610,7 @@
               </w:rPr>
               <w:t>M.Pd</w:t>
             </w:r>
+            <w:proofErr w:type="spellEnd"/>
             <w:proofErr w:type="gramEnd"/>
           </w:p>
         </w:tc>
@@ -548,14 +642,65 @@
                 <w:lang w:eastAsia="en-ID"/>
               </w:rPr>
             </w:pPr>
-            <w:r>
-              <w:rPr>
-                <w:rFonts w:ascii="Times New Roman" w:eastAsia="Times New Roman" w:hAnsi="Times New Roman" w:cs="Times New Roman"/>
-                <w:sz w:val="24"/>
-                <w:szCs w:val="24"/>
-                <w:lang w:eastAsia="en-ID"/>
-              </w:rPr>
-              <w:t>Akses penuh seluruh Executive Dashboard, Approval Surat, &amp; System Command</w:t>
+            <w:proofErr w:type="spellStart"/>
+            <w:r>
+              <w:rPr>
+                <w:rFonts w:ascii="Times New Roman" w:eastAsia="Times New Roman" w:hAnsi="Times New Roman" w:cs="Times New Roman"/>
+                <w:sz w:val="24"/>
+                <w:szCs w:val="24"/>
+                <w:lang w:eastAsia="en-ID"/>
+              </w:rPr>
+              <w:t>Akses</w:t>
+            </w:r>
+            <w:proofErr w:type="spellEnd"/>
+            <w:r>
+              <w:rPr>
+                <w:rFonts w:ascii="Times New Roman" w:eastAsia="Times New Roman" w:hAnsi="Times New Roman" w:cs="Times New Roman"/>
+                <w:sz w:val="24"/>
+                <w:szCs w:val="24"/>
+                <w:lang w:eastAsia="en-ID"/>
+              </w:rPr>
+              <w:t xml:space="preserve"> </w:t>
+            </w:r>
+            <w:proofErr w:type="spellStart"/>
+            <w:r>
+              <w:rPr>
+                <w:rFonts w:ascii="Times New Roman" w:eastAsia="Times New Roman" w:hAnsi="Times New Roman" w:cs="Times New Roman"/>
+                <w:sz w:val="24"/>
+                <w:szCs w:val="24"/>
+                <w:lang w:eastAsia="en-ID"/>
+              </w:rPr>
+              <w:t>penuh</w:t>
+            </w:r>
+            <w:proofErr w:type="spellEnd"/>
+            <w:r>
+              <w:rPr>
+                <w:rFonts w:ascii="Times New Roman" w:eastAsia="Times New Roman" w:hAnsi="Times New Roman" w:cs="Times New Roman"/>
+                <w:sz w:val="24"/>
+                <w:szCs w:val="24"/>
+                <w:lang w:eastAsia="en-ID"/>
+              </w:rPr>
+              <w:t xml:space="preserve"> </w:t>
+            </w:r>
+            <w:proofErr w:type="spellStart"/>
+            <w:r>
+              <w:rPr>
+                <w:rFonts w:ascii="Times New Roman" w:eastAsia="Times New Roman" w:hAnsi="Times New Roman" w:cs="Times New Roman"/>
+                <w:sz w:val="24"/>
+                <w:szCs w:val="24"/>
+                <w:lang w:eastAsia="en-ID"/>
+              </w:rPr>
+              <w:t>seluruh</w:t>
+            </w:r>
+            <w:proofErr w:type="spellEnd"/>
+            <w:r>
+              <w:rPr>
+                <w:rFonts w:ascii="Times New Roman" w:eastAsia="Times New Roman" w:hAnsi="Times New Roman" w:cs="Times New Roman"/>
+                <w:sz w:val="24"/>
+                <w:szCs w:val="24"/>
+                <w:lang w:eastAsia="en-ID"/>
+              </w:rPr>
+              <w:t xml:space="preserve"> Executive Dashboard, Approval Surat, &amp; System Command</w:t>
             </w:r>
           </w:p>
         </w:tc>
@@ -601,7 +746,31 @@
                 <w:szCs w:val="24"/>
                 <w:lang w:eastAsia="en-ID"/>
               </w:rPr>
-              <w:t>Guru / Wali Kelas</w:t>
+              <w:t xml:space="preserve">Guru / </w:t>
+            </w:r>
+            <w:proofErr w:type="spellStart"/>
+            <w:r>
+              <w:rPr>
+                <w:rFonts w:ascii="Times New Roman" w:eastAsia="Times New Roman" w:hAnsi="Times New Roman" w:cs="Times New Roman"/>
+                <w:b/>
+                <w:bCs/>
+                <w:sz w:val="24"/>
+                <w:szCs w:val="24"/>
+                <w:lang w:eastAsia="en-ID"/>
+              </w:rPr>
+              <w:t>Wali</w:t>
+            </w:r>
+            <w:proofErr w:type="spellEnd"/>
+            <w:r>
+              <w:rPr>
+                <w:rFonts w:ascii="Times New Roman" w:eastAsia="Times New Roman" w:hAnsi="Times New Roman" w:cs="Times New Roman"/>
+                <w:b/>
+                <w:bCs/>
+                <w:sz w:val="24"/>
+                <w:szCs w:val="24"/>
+                <w:lang w:eastAsia="en-ID"/>
+              </w:rPr>
+              <w:t xml:space="preserve"> Kelas</w:t>
             </w:r>
           </w:p>
         </w:tc>
@@ -711,16 +880,29 @@
                 <w:lang w:eastAsia="en-ID"/>
               </w:rPr>
             </w:pPr>
-            <w:r>
-              <w:rPr>
-                <w:rFonts w:ascii="Times New Roman" w:eastAsia="Times New Roman" w:hAnsi="Times New Roman" w:cs="Times New Roman"/>
-                <w:b/>
-                <w:bCs/>
-                <w:sz w:val="24"/>
-                <w:szCs w:val="24"/>
-                <w:lang w:eastAsia="en-ID"/>
-              </w:rPr>
-              <w:t>Ustadz Abdullah</w:t>
+            <w:proofErr w:type="spellStart"/>
+            <w:r>
+              <w:rPr>
+                <w:rFonts w:ascii="Times New Roman" w:eastAsia="Times New Roman" w:hAnsi="Times New Roman" w:cs="Times New Roman"/>
+                <w:b/>
+                <w:bCs/>
+                <w:sz w:val="24"/>
+                <w:szCs w:val="24"/>
+                <w:lang w:eastAsia="en-ID"/>
+              </w:rPr>
+              <w:t>Ustadz</w:t>
+            </w:r>
+            <w:proofErr w:type="spellEnd"/>
+            <w:r>
+              <w:rPr>
+                <w:rFonts w:ascii="Times New Roman" w:eastAsia="Times New Roman" w:hAnsi="Times New Roman" w:cs="Times New Roman"/>
+                <w:b/>
+                <w:bCs/>
+                <w:sz w:val="24"/>
+                <w:szCs w:val="24"/>
+                <w:lang w:eastAsia="en-ID"/>
+              </w:rPr>
+              <w:t xml:space="preserve"> Abdullah</w:t>
             </w:r>
           </w:p>
         </w:tc>
@@ -759,7 +941,47 @@
                 <w:szCs w:val="24"/>
                 <w:lang w:eastAsia="en-ID"/>
               </w:rPr>
-              <w:t>Input Presensi, Modul Dokumen, Internal Chat, &amp; Event Calendar</w:t>
+              <w:t xml:space="preserve">Input </w:t>
+            </w:r>
+            <w:proofErr w:type="spellStart"/>
+            <w:r>
+              <w:rPr>
+                <w:rFonts w:ascii="Times New Roman" w:eastAsia="Times New Roman" w:hAnsi="Times New Roman" w:cs="Times New Roman"/>
+                <w:sz w:val="24"/>
+                <w:szCs w:val="24"/>
+                <w:lang w:eastAsia="en-ID"/>
+              </w:rPr>
+              <w:t>Presensi</w:t>
+            </w:r>
+            <w:proofErr w:type="spellEnd"/>
+            <w:r>
+              <w:rPr>
+                <w:rFonts w:ascii="Times New Roman" w:eastAsia="Times New Roman" w:hAnsi="Times New Roman" w:cs="Times New Roman"/>
+                <w:sz w:val="24"/>
+                <w:szCs w:val="24"/>
+                <w:lang w:eastAsia="en-ID"/>
+              </w:rPr>
+              <w:t xml:space="preserve">, Modul </w:t>
+            </w:r>
+            <w:proofErr w:type="spellStart"/>
+            <w:r>
+              <w:rPr>
+                <w:rFonts w:ascii="Times New Roman" w:eastAsia="Times New Roman" w:hAnsi="Times New Roman" w:cs="Times New Roman"/>
+                <w:sz w:val="24"/>
+                <w:szCs w:val="24"/>
+                <w:lang w:eastAsia="en-ID"/>
+              </w:rPr>
+              <w:t>Dokumen</w:t>
+            </w:r>
+            <w:proofErr w:type="spellEnd"/>
+            <w:r>
+              <w:rPr>
+                <w:rFonts w:ascii="Times New Roman" w:eastAsia="Times New Roman" w:hAnsi="Times New Roman" w:cs="Times New Roman"/>
+                <w:sz w:val="24"/>
+                <w:szCs w:val="24"/>
+                <w:lang w:eastAsia="en-ID"/>
+              </w:rPr>
+              <w:t>, Internal Chat, &amp; Event Calendar</w:t>
             </w:r>
           </w:p>
         </w:tc>
@@ -796,6 +1018,7 @@
                 <w:lang w:eastAsia="en-ID"/>
               </w:rPr>
             </w:pPr>
+            <w:proofErr w:type="spellStart"/>
             <w:r>
               <w:rPr>
                 <w:rFonts w:ascii="Times New Roman" w:eastAsia="Times New Roman" w:hAnsi="Times New Roman" w:cs="Times New Roman"/>
@@ -806,8 +1029,33 @@
                 <w:lang w:eastAsia="en-ID"/>
               </w:rPr>
               <w:lastRenderedPageBreak/>
-              <w:t>Staf Sarpras</w:t>
-            </w:r>
+              <w:t>Staf</w:t>
+            </w:r>
+            <w:proofErr w:type="spellEnd"/>
+            <w:r>
+              <w:rPr>
+                <w:rFonts w:ascii="Times New Roman" w:eastAsia="Times New Roman" w:hAnsi="Times New Roman" w:cs="Times New Roman"/>
+                <w:b/>
+                <w:bCs/>
+                <w:sz w:val="24"/>
+                <w:szCs w:val="24"/>
+                <w:lang w:eastAsia="en-ID"/>
+              </w:rPr>
+              <w:t xml:space="preserve"> </w:t>
+            </w:r>
+            <w:proofErr w:type="spellStart"/>
+            <w:r>
+              <w:rPr>
+                <w:rFonts w:ascii="Times New Roman" w:eastAsia="Times New Roman" w:hAnsi="Times New Roman" w:cs="Times New Roman"/>
+                <w:b/>
+                <w:bCs/>
+                <w:sz w:val="24"/>
+                <w:szCs w:val="24"/>
+                <w:lang w:eastAsia="en-ID"/>
+              </w:rPr>
+              <w:t>Sarpras</w:t>
+            </w:r>
+            <w:proofErr w:type="spellEnd"/>
           </w:p>
         </w:tc>
         <w:tc>

</xml_diff>